<commit_message>
Reformat all DOCX — remove PageBreakBefore from all headings, fix KeepWithNext/KeepTogether on body, enable table row splits, normalize spacing
</commit_message>
<xml_diff>
--- a/proposals/TwinMaq-Financial-Proposal-Template.docx
+++ b/proposals/TwinMaq-Financial-Proposal-Template.docx
@@ -260,16 +260,7 @@
                 <w:sz w:val="16"/>
                 <w:szCs w:val="16"/>
               </w:rPr>
-              <w:t xml:space="preserve">ISO 9001 Certified  ·  KSA &amp; GCC  ·  </w:t>
-            </w:r>
-            <w:r>
-              <w:rPr>
-                <w:rFonts w:ascii="Calibri" w:eastAsia="Times New Roman" w:hAnsi="Calibri" w:cs="Calibri"/>
-                <w:color w:val="A0C0E0"/>
-                <w:sz w:val="16"/>
-                <w:szCs w:val="16"/>
-              </w:rPr>
-              <w:t>www.designzone.com.sa</w:t>
+              <w:t>ISO 9001 Certified  ·  KSA &amp; GCC  ·  www.designzone.com.sa</w:t>
             </w:r>
             <w:r>
               <w:rPr>
@@ -356,7 +347,7 @@
     <w:p>
       <w:pPr>
         <w:pStyle w:val="NormalWeb"/>
-        <w:spacing w:after="840"/>
+        <w:spacing w:after="80"/>
         <w:jc w:val="center"/>
         <w:rPr>
           <w:rFonts w:ascii="Calibri" w:hAnsi="Calibri" w:cs="Calibri"/>
@@ -455,7 +446,7 @@
     <w:p>
       <w:pPr>
         <w:pStyle w:val="NormalWeb"/>
-        <w:spacing w:after="720"/>
+        <w:spacing w:after="80"/>
         <w:jc w:val="center"/>
         <w:rPr>
           <w:rFonts w:ascii="Calibri" w:hAnsi="Calibri" w:cs="Calibri"/>
@@ -1132,6 +1123,182 @@
               <w:t>Sundos Soror  |  Business Development</w:t>
             </w:r>
           </w:p>
+          <w:p>
+            <w:pPr>
+              <w:rPr>
+                <w:rFonts w:ascii="Calibri" w:eastAsia="Times New Roman" w:hAnsi="Calibri" w:cs="Calibri"/>
+                <w:color w:val="1A1A1A"/>
+                <w:sz w:val="19"/>
+                <w:szCs w:val="19"/>
+              </w:rPr>
+            </w:pPr>
+          </w:p>
+        </w:tc>
+      </w:tr>
+      <w:tr>
+        <w:trPr>
+          <w:tblCellSpacing w:w="0" w:type="dxa"/>
+          <w:jc w:val="center"/>
+        </w:trPr>
+        <w:tc>
+          <w:tcPr>
+            <w:tcW w:w="0" w:type="auto"/>
+            <w:tcBorders>
+              <w:bottom w:val="single" w:sz="8" w:space="0" w:color="EEF3F9"/>
+            </w:tcBorders>
+            <w:tcMar>
+              <w:top w:w="80" w:type="dxa"/>
+              <w:left w:w="0" w:type="dxa"/>
+              <w:bottom w:w="80" w:type="dxa"/>
+              <w:right w:w="0" w:type="dxa"/>
+            </w:tcMar>
+            <w:vAlign w:val="center"/>
+          </w:tcPr>
+          <w:p>
+            <w:pPr>
+              <w:rPr>
+                <w:rFonts w:ascii="Calibri" w:eastAsia="Times New Roman" w:hAnsi="Calibri" w:cs="Calibri"/>
+                <w:b/>
+                <w:bCs/>
+                <w:color w:val="1A3A5C"/>
+                <w:sz w:val="19"/>
+                <w:szCs w:val="19"/>
+              </w:rPr>
+            </w:pPr>
+          </w:p>
+          <w:p>
+            <w:pPr>
+              <w:rPr>
+                <w:rFonts w:ascii="Calibri" w:eastAsia="Times New Roman" w:hAnsi="Calibri" w:cs="Calibri"/>
+                <w:b/>
+                <w:bCs/>
+                <w:color w:val="1A3A5C"/>
+                <w:sz w:val="19"/>
+                <w:szCs w:val="19"/>
+              </w:rPr>
+            </w:pPr>
+          </w:p>
+          <w:p>
+            <w:pPr>
+              <w:rPr>
+                <w:rFonts w:ascii="Calibri" w:eastAsia="Times New Roman" w:hAnsi="Calibri" w:cs="Calibri"/>
+                <w:b/>
+                <w:bCs/>
+                <w:color w:val="1A3A5C"/>
+                <w:sz w:val="19"/>
+                <w:szCs w:val="19"/>
+              </w:rPr>
+            </w:pPr>
+          </w:p>
+          <w:p>
+            <w:pPr>
+              <w:rPr>
+                <w:rFonts w:ascii="Calibri" w:eastAsia="Times New Roman" w:hAnsi="Calibri" w:cs="Calibri"/>
+                <w:b/>
+                <w:bCs/>
+                <w:color w:val="1A3A5C"/>
+                <w:sz w:val="19"/>
+                <w:szCs w:val="19"/>
+              </w:rPr>
+            </w:pPr>
+          </w:p>
+          <w:p>
+            <w:pPr>
+              <w:rPr>
+                <w:rFonts w:ascii="Calibri" w:eastAsia="Times New Roman" w:hAnsi="Calibri" w:cs="Calibri"/>
+                <w:b/>
+                <w:bCs/>
+                <w:color w:val="1A3A5C"/>
+                <w:sz w:val="19"/>
+                <w:szCs w:val="19"/>
+              </w:rPr>
+            </w:pPr>
+          </w:p>
+          <w:p>
+            <w:pPr>
+              <w:rPr>
+                <w:rFonts w:ascii="Calibri" w:eastAsia="Times New Roman" w:hAnsi="Calibri" w:cs="Calibri"/>
+                <w:b/>
+                <w:bCs/>
+                <w:color w:val="1A3A5C"/>
+                <w:sz w:val="19"/>
+                <w:szCs w:val="19"/>
+              </w:rPr>
+            </w:pPr>
+          </w:p>
+          <w:p>
+            <w:pPr>
+              <w:rPr>
+                <w:rFonts w:ascii="Calibri" w:eastAsia="Times New Roman" w:hAnsi="Calibri" w:cs="Calibri"/>
+                <w:b/>
+                <w:bCs/>
+                <w:color w:val="1A3A5C"/>
+                <w:sz w:val="19"/>
+                <w:szCs w:val="19"/>
+              </w:rPr>
+            </w:pPr>
+          </w:p>
+          <w:p>
+            <w:pPr>
+              <w:rPr>
+                <w:rFonts w:ascii="Calibri" w:eastAsia="Times New Roman" w:hAnsi="Calibri" w:cs="Calibri"/>
+                <w:b/>
+                <w:bCs/>
+                <w:color w:val="1A3A5C"/>
+                <w:sz w:val="19"/>
+                <w:szCs w:val="19"/>
+              </w:rPr>
+            </w:pPr>
+          </w:p>
+          <w:p>
+            <w:pPr>
+              <w:rPr>
+                <w:rFonts w:ascii="Calibri" w:eastAsia="Times New Roman" w:hAnsi="Calibri" w:cs="Calibri"/>
+                <w:b/>
+                <w:bCs/>
+                <w:color w:val="1A3A5C"/>
+                <w:sz w:val="19"/>
+                <w:szCs w:val="19"/>
+              </w:rPr>
+            </w:pPr>
+          </w:p>
+          <w:p>
+            <w:pPr>
+              <w:rPr>
+                <w:rFonts w:ascii="Calibri" w:eastAsia="Times New Roman" w:hAnsi="Calibri" w:cs="Calibri"/>
+                <w:b/>
+                <w:bCs/>
+                <w:color w:val="1A3A5C"/>
+                <w:sz w:val="19"/>
+                <w:szCs w:val="19"/>
+              </w:rPr>
+            </w:pPr>
+          </w:p>
+        </w:tc>
+        <w:tc>
+          <w:tcPr>
+            <w:tcW w:w="0" w:type="auto"/>
+            <w:tcBorders>
+              <w:bottom w:val="single" w:sz="8" w:space="0" w:color="EEF3F9"/>
+            </w:tcBorders>
+            <w:tcMar>
+              <w:top w:w="80" w:type="dxa"/>
+              <w:left w:w="240" w:type="dxa"/>
+              <w:bottom w:w="80" w:type="dxa"/>
+              <w:right w:w="0" w:type="dxa"/>
+            </w:tcMar>
+            <w:vAlign w:val="center"/>
+          </w:tcPr>
+          <w:p>
+            <w:pPr>
+              <w:rPr>
+                <w:rFonts w:ascii="Calibri" w:eastAsia="Times New Roman" w:hAnsi="Calibri" w:cs="Calibri"/>
+                <w:color w:val="1A1A1A"/>
+                <w:sz w:val="19"/>
+                <w:szCs w:val="19"/>
+              </w:rPr>
+            </w:pPr>
+          </w:p>
         </w:tc>
       </w:tr>
       <w:tr>
@@ -1339,6 +1506,7 @@
     <w:p>
       <w:pPr>
         <w:pStyle w:val="Heading1"/>
+        <w:keepNext w:val="0"/>
         <w:spacing w:before="100"/>
         <w:divId w:val="1034037058"/>
         <w:rPr>
@@ -1372,7 +1540,17 @@
           <w:sz w:val="20"/>
           <w:szCs w:val="20"/>
         </w:rPr>
-        <w:t>Design Zone is a Saudi-based engineering and digital solutions company specialising in Building Information Modeling (BIM), interactive 3D visualisation, and immersive digital twin technologies. Founded with a mission to bridge the gap between engineering precision and compelling visual communication, Design Zone serves developers, architects, government authorities, and real estate investors across the Kingdom of Saudi Arabia and the wider GCC region.</w:t>
+        <w:t xml:space="preserve">Design Zone is a Saudi-based engineering and digital solutions company specialising in Building Information Modeling (BIM), interactive 3D visualisation, and immersive digital twin technologies. Founded with a mission to bridge the gap </w:t>
+      </w:r>
+      <w:r>
+        <w:rPr>
+          <w:rFonts w:ascii="Calibri" w:hAnsi="Calibri" w:cs="Calibri"/>
+          <w:color w:val="1A1A1A"/>
+          <w:sz w:val="20"/>
+          <w:szCs w:val="20"/>
+        </w:rPr>
+        <w:lastRenderedPageBreak/>
+        <w:t>between engineering precision and compelling visual communication, Design Zone serves developers, architects, government authorities, and real estate investors across the Kingdom of Saudi Arabia and the wider GCC region.</w:t>
       </w:r>
     </w:p>
     <w:p>
@@ -1393,17 +1571,7 @@
           <w:sz w:val="20"/>
           <w:szCs w:val="20"/>
         </w:rPr>
-        <w:t xml:space="preserve">Our team brings together expertise in architectural visualisation, 3D asset development, web platform engineering, and interactive experience design. We operate under ISO 9001 standards, ensuring every deliverable meets the highest </w:t>
-      </w:r>
-      <w:r>
-        <w:rPr>
-          <w:rFonts w:ascii="Calibri" w:hAnsi="Calibri" w:cs="Calibri"/>
-          <w:color w:val="1A1A1A"/>
-          <w:sz w:val="20"/>
-          <w:szCs w:val="20"/>
-        </w:rPr>
-        <w:lastRenderedPageBreak/>
-        <w:t>benchmarks of accuracy, performance, and professional presentation. TwinMaq is our flagship PropTech product — the convergence of 3D modelling, real-time rendering, and user experience design into a single, scalable, client-facing platform.</w:t>
+        <w:t>Our team brings together expertise in architectural visualisation, 3D asset development, web platform engineering, and interactive experience design. We operate under ISO 9001 standards, ensuring every deliverable meets the highest benchmarks of accuracy, performance, and professional presentation. TwinMaq is our flagship PropTech product — the convergence of 3D modelling, real-time rendering, and user experience design into a single, scalable, client-facing platform.</w:t>
       </w:r>
     </w:p>
     <w:tbl>
@@ -1451,7 +1619,7 @@
           </w:tcPr>
           <w:p>
             <w:pPr>
-              <w:spacing w:after="240"/>
+              <w:spacing w:after="40"/>
               <w:jc w:val="center"/>
               <w:rPr>
                 <w:rFonts w:ascii="Calibri" w:eastAsia="Times New Roman" w:hAnsi="Calibri" w:cs="Calibri"/>
@@ -1465,6 +1633,7 @@
                 <w:rStyle w:val="sv2"/>
                 <w:rFonts w:ascii="Calibri" w:eastAsia="Times New Roman" w:hAnsi="Calibri" w:cs="Calibri"/>
                 <w:color w:val="FFFFFF"/>
+                <w:specVanish w:val="0"/>
               </w:rPr>
               <w:t>10+</w:t>
             </w:r>
@@ -1473,6 +1642,7 @@
                 <w:rStyle w:val="sl2"/>
                 <w:rFonts w:ascii="Calibri" w:eastAsia="Times New Roman" w:hAnsi="Calibri" w:cs="Calibri"/>
                 <w:color w:val="FFFFFF"/>
+                <w:specVanish w:val="0"/>
               </w:rPr>
               <w:t>YEARS OF EXPERIENCE</w:t>
             </w:r>
@@ -1499,7 +1669,7 @@
           </w:tcPr>
           <w:p>
             <w:pPr>
-              <w:spacing w:after="240"/>
+              <w:spacing w:after="40"/>
               <w:jc w:val="center"/>
               <w:rPr>
                 <w:rFonts w:ascii="Calibri" w:eastAsia="Times New Roman" w:hAnsi="Calibri" w:cs="Calibri"/>
@@ -1531,7 +1701,7 @@
           </w:tcPr>
           <w:p>
             <w:pPr>
-              <w:spacing w:after="240"/>
+              <w:spacing w:after="40"/>
               <w:jc w:val="center"/>
               <w:rPr>
                 <w:rFonts w:ascii="Calibri" w:eastAsia="Times New Roman" w:hAnsi="Calibri" w:cs="Calibri"/>
@@ -1545,6 +1715,7 @@
                 <w:rStyle w:val="sv2"/>
                 <w:rFonts w:ascii="Calibri" w:eastAsia="Times New Roman" w:hAnsi="Calibri" w:cs="Calibri"/>
                 <w:color w:val="FFFFFF"/>
+                <w:specVanish w:val="0"/>
               </w:rPr>
               <w:t>200+</w:t>
             </w:r>
@@ -1553,6 +1724,7 @@
                 <w:rStyle w:val="sl2"/>
                 <w:rFonts w:ascii="Calibri" w:eastAsia="Times New Roman" w:hAnsi="Calibri" w:cs="Calibri"/>
                 <w:color w:val="FFFFFF"/>
+                <w:specVanish w:val="0"/>
               </w:rPr>
               <w:t>PROJECTS DELIVERED</w:t>
             </w:r>
@@ -1579,7 +1751,7 @@
           </w:tcPr>
           <w:p>
             <w:pPr>
-              <w:spacing w:after="240"/>
+              <w:spacing w:after="40"/>
               <w:jc w:val="center"/>
               <w:rPr>
                 <w:rFonts w:ascii="Calibri" w:eastAsia="Times New Roman" w:hAnsi="Calibri" w:cs="Calibri"/>
@@ -1611,7 +1783,7 @@
           </w:tcPr>
           <w:p>
             <w:pPr>
-              <w:spacing w:after="240"/>
+              <w:spacing w:after="40"/>
               <w:jc w:val="center"/>
               <w:rPr>
                 <w:rFonts w:ascii="Calibri" w:eastAsia="Times New Roman" w:hAnsi="Calibri" w:cs="Calibri"/>
@@ -1625,6 +1797,7 @@
                 <w:rStyle w:val="sv2"/>
                 <w:rFonts w:ascii="Calibri" w:eastAsia="Times New Roman" w:hAnsi="Calibri" w:cs="Calibri"/>
                 <w:color w:val="FFFFFF"/>
+                <w:specVanish w:val="0"/>
               </w:rPr>
               <w:t>ISO 9001</w:t>
             </w:r>
@@ -1633,6 +1806,7 @@
                 <w:rStyle w:val="sl2"/>
                 <w:rFonts w:ascii="Calibri" w:eastAsia="Times New Roman" w:hAnsi="Calibri" w:cs="Calibri"/>
                 <w:color w:val="FFFFFF"/>
+                <w:specVanish w:val="0"/>
               </w:rPr>
               <w:t>CERTIFIED QUALITY</w:t>
             </w:r>
@@ -1659,7 +1833,7 @@
           </w:tcPr>
           <w:p>
             <w:pPr>
-              <w:spacing w:after="240"/>
+              <w:spacing w:after="40"/>
               <w:jc w:val="center"/>
               <w:rPr>
                 <w:rFonts w:ascii="Calibri" w:eastAsia="Times New Roman" w:hAnsi="Calibri" w:cs="Calibri"/>
@@ -1691,7 +1865,7 @@
           </w:tcPr>
           <w:p>
             <w:pPr>
-              <w:spacing w:after="240"/>
+              <w:spacing w:after="40"/>
               <w:jc w:val="center"/>
               <w:rPr>
                 <w:rFonts w:ascii="Calibri" w:eastAsia="Times New Roman" w:hAnsi="Calibri" w:cs="Calibri"/>
@@ -1705,6 +1879,7 @@
                 <w:rStyle w:val="sv2"/>
                 <w:rFonts w:ascii="Calibri" w:eastAsia="Times New Roman" w:hAnsi="Calibri" w:cs="Calibri"/>
                 <w:color w:val="FFFFFF"/>
+                <w:specVanish w:val="0"/>
               </w:rPr>
               <w:t>KSA &amp; GCC</w:t>
             </w:r>
@@ -1713,6 +1888,7 @@
                 <w:rStyle w:val="sl2"/>
                 <w:rFonts w:ascii="Calibri" w:eastAsia="Times New Roman" w:hAnsi="Calibri" w:cs="Calibri"/>
                 <w:color w:val="FFFFFF"/>
+                <w:specVanish w:val="0"/>
               </w:rPr>
               <w:t>MARKET COVERAGE</w:t>
             </w:r>
@@ -1723,6 +1899,8 @@
     <w:p>
       <w:pPr>
         <w:pStyle w:val="Heading2"/>
+        <w:keepNext w:val="0"/>
+        <w:spacing w:before="80"/>
         <w:divId w:val="1198852416"/>
         <w:rPr>
           <w:rFonts w:ascii="Calibri" w:eastAsia="Times New Roman" w:hAnsi="Calibri" w:cs="Calibri"/>
@@ -2162,16 +2340,7 @@
                 <w:sz w:val="19"/>
                 <w:szCs w:val="19"/>
               </w:rPr>
-              <w:t xml:space="preserve">ISO 9001 — </w:t>
-            </w:r>
-            <w:r>
-              <w:rPr>
-                <w:rFonts w:ascii="Calibri" w:eastAsia="Times New Roman" w:hAnsi="Calibri" w:cs="Calibri"/>
-                <w:color w:val="1A1A1A"/>
-                <w:sz w:val="19"/>
-                <w:szCs w:val="19"/>
-              </w:rPr>
-              <w:t>Interactive Web Platform for Digital Project Showcase</w:t>
+              <w:t>ISO 9001 — Interactive Web Platform for Digital Project Showcase</w:t>
             </w:r>
           </w:p>
         </w:tc>
@@ -2504,6 +2673,8 @@
     <w:p>
       <w:pPr>
         <w:pStyle w:val="Heading2"/>
+        <w:keepNext w:val="0"/>
+        <w:spacing w:before="80"/>
         <w:divId w:val="138040094"/>
         <w:rPr>
           <w:rFonts w:ascii="Calibri" w:eastAsia="Times New Roman" w:hAnsi="Calibri" w:cs="Calibri"/>
@@ -2615,16 +2786,7 @@
           <w:sz w:val="20"/>
           <w:szCs w:val="20"/>
         </w:rPr>
-        <w:t xml:space="preserve"> </w:t>
-      </w:r>
-      <w:r>
-        <w:rPr>
-          <w:rFonts w:ascii="Calibri" w:eastAsia="Times New Roman" w:hAnsi="Calibri" w:cs="Calibri"/>
-          <w:color w:val="1A1A1A"/>
-          <w:sz w:val="20"/>
-          <w:szCs w:val="20"/>
-        </w:rPr>
-        <w:t>TwinMaq is natively bilingual — Arabic is the primary interface language, built RTL-first, not retrofitted as a translation layer.</w:t>
+        <w:t xml:space="preserve"> TwinMaq is natively bilingual — Arabic is the primary interface language, built RTL-first, not retrofitted as a translation layer.</w:t>
       </w:r>
     </w:p>
     <w:p>
@@ -2683,6 +2845,7 @@
           <w:sz w:val="20"/>
           <w:szCs w:val="20"/>
         </w:rPr>
+        <w:lastRenderedPageBreak/>
         <w:t>Long-Term Partnership:</w:t>
       </w:r>
       <w:r>
@@ -2698,6 +2861,7 @@
     <w:p>
       <w:pPr>
         <w:pStyle w:val="Heading1"/>
+        <w:keepNext w:val="0"/>
         <w:divId w:val="674501682"/>
         <w:rPr>
           <w:rFonts w:ascii="Calibri" w:eastAsia="Times New Roman" w:hAnsi="Calibri" w:cs="Calibri"/>
@@ -2715,7 +2879,6 @@
           <w:sz w:val="34"/>
           <w:szCs w:val="34"/>
         </w:rPr>
-        <w:lastRenderedPageBreak/>
         <w:t>Table of Contents</w:t>
       </w:r>
     </w:p>
@@ -3062,7 +3225,6 @@
     </w:p>
     <w:p>
       <w:pPr>
-        <w:pageBreakBefore/>
         <w:shd w:val="clear" w:color="auto" w:fill="1A3A5C"/>
         <w:divId w:val="1491753255"/>
         <w:rPr>
@@ -3091,7 +3253,7 @@
     <w:p>
       <w:pPr>
         <w:pStyle w:val="Heading1"/>
-        <w:pageBreakBefore/>
+        <w:keepNext w:val="0"/>
         <w:spacing w:before="100"/>
         <w:divId w:val="2088569275"/>
         <w:rPr>
@@ -3110,7 +3272,6 @@
     <w:p>
       <w:pPr>
         <w:pStyle w:val="NormalWeb"/>
-        <w:pageBreakBefore/>
         <w:divId w:val="2088569275"/>
         <w:rPr>
           <w:rFonts w:ascii="Calibri" w:hAnsi="Calibri" w:cs="Calibri"/>
@@ -3132,7 +3293,6 @@
     <w:p>
       <w:pPr>
         <w:pStyle w:val="NormalWeb"/>
-        <w:pageBreakBefore/>
         <w:divId w:val="2088569275"/>
         <w:rPr>
           <w:rFonts w:ascii="Calibri" w:hAnsi="Calibri" w:cs="Calibri"/>
@@ -3153,7 +3313,6 @@
     </w:p>
     <w:p>
       <w:pPr>
-        <w:pageBreakBefore/>
         <w:shd w:val="clear" w:color="auto" w:fill="EEF3F9"/>
         <w:divId w:val="1481846706"/>
         <w:rPr>
@@ -3197,22 +3356,14 @@
           <w:sz w:val="19"/>
           <w:szCs w:val="19"/>
         </w:rPr>
-        <w:t xml:space="preserve"> </w:t>
-      </w:r>
-      <w:r>
-        <w:rPr>
-          <w:rFonts w:ascii="Calibri" w:eastAsia="Times New Roman" w:hAnsi="Calibri" w:cs="Calibri"/>
-          <w:color w:val="1A1A1A"/>
-          <w:sz w:val="19"/>
-          <w:szCs w:val="19"/>
-        </w:rPr>
-        <w:t>from the date of issue. After this period, Design Zone reserves the right to revise pricing before issuing a renewed quotation.</w:t>
+        <w:t xml:space="preserve"> from the date of issue. After this period, Design Zone reserves the right to revise pricing before issuing a renewed quotation.</w:t>
       </w:r>
     </w:p>
     <w:p>
       <w:pPr>
         <w:pStyle w:val="Heading2"/>
-        <w:pageBreakBefore/>
+        <w:keepNext w:val="0"/>
+        <w:spacing w:before="80"/>
         <w:divId w:val="756947876"/>
         <w:rPr>
           <w:rFonts w:ascii="Calibri" w:eastAsia="Times New Roman" w:hAnsi="Calibri" w:cs="Calibri"/>
@@ -3633,6 +3784,7 @@
                 <w:sz w:val="19"/>
                 <w:szCs w:val="19"/>
               </w:rPr>
+              <w:lastRenderedPageBreak/>
               <w:t>07 — Project Scale Totals</w:t>
             </w:r>
           </w:p>
@@ -3842,7 +3994,8 @@
     <w:p>
       <w:pPr>
         <w:pStyle w:val="Heading2"/>
-        <w:pageBreakBefore/>
+        <w:keepNext w:val="0"/>
+        <w:spacing w:before="80"/>
         <w:divId w:val="624387192"/>
         <w:rPr>
           <w:rFonts w:ascii="Calibri" w:eastAsia="Times New Roman" w:hAnsi="Calibri" w:cs="Calibri"/>
@@ -4290,7 +4443,6 @@
     </w:tbl>
     <w:p>
       <w:pPr>
-        <w:pageBreakBefore/>
         <w:shd w:val="clear" w:color="auto" w:fill="1A3A5C"/>
         <w:divId w:val="1630235687"/>
         <w:rPr>
@@ -4319,7 +4471,7 @@
     <w:p>
       <w:pPr>
         <w:pStyle w:val="Heading1"/>
-        <w:pageBreakBefore/>
+        <w:keepNext w:val="0"/>
         <w:spacing w:before="100"/>
         <w:divId w:val="119231503"/>
         <w:rPr>
@@ -4338,7 +4490,6 @@
     <w:p>
       <w:pPr>
         <w:pStyle w:val="NormalWeb"/>
-        <w:pageBreakBefore/>
         <w:divId w:val="119231503"/>
         <w:rPr>
           <w:rFonts w:ascii="Calibri" w:hAnsi="Calibri" w:cs="Calibri"/>
@@ -4360,7 +4511,6 @@
     <w:p>
       <w:pPr>
         <w:pStyle w:val="NormalWeb"/>
-        <w:pageBreakBefore/>
         <w:divId w:val="119231503"/>
         <w:rPr>
           <w:rFonts w:ascii="Calibri" w:hAnsi="Calibri" w:cs="Calibri"/>
@@ -4590,7 +4740,7 @@
                 <w:sz w:val="18"/>
                 <w:szCs w:val="18"/>
               </w:rPr>
-              <w:t xml:space="preserve">Branded landing page · Exterior masterplan day/night · </w:t>
+              <w:t xml:space="preserve">Branded landing page · Exterior masterplan day/night · Interactive 2D location map · Unit selection interface (colour-coded, live availability) · Unit </w:t>
             </w:r>
             <w:r>
               <w:rPr>
@@ -4599,7 +4749,8 @@
                 <w:sz w:val="18"/>
                 <w:szCs w:val="18"/>
               </w:rPr>
-              <w:t>Interactive 2D location map · Unit selection interface (colour-coded, live availability) · Unit Comparison Engine · Bilingual Arabic/English RTL/LTR · Lead capture module · Admin dashboard (unit management + lead inbox + analytics) · Cloud hosting Year 1 (SSL, CDN, 99.9% uptime, daily backups) · 2 revision rounds</w:t>
+              <w:lastRenderedPageBreak/>
+              <w:t>Comparison Engine · Bilingual Arabic/English RTL/LTR · Lead capture module · Admin dashboard (unit management + lead inbox + analytics) · Cloud hosting Year 1 (SSL, CDN, 99.9% uptime, daily backups) · 2 revision rounds</w:t>
             </w:r>
           </w:p>
         </w:tc>
@@ -4639,6 +4790,7 @@
                 <w:sz w:val="19"/>
                 <w:szCs w:val="19"/>
               </w:rPr>
+              <w:lastRenderedPageBreak/>
               <w:t>45,000</w:t>
             </w:r>
           </w:p>
@@ -5283,7 +5435,6 @@
     </w:tbl>
     <w:p>
       <w:pPr>
-        <w:pageBreakBefore/>
         <w:shd w:val="clear" w:color="auto" w:fill="EEF3F9"/>
         <w:divId w:val="1563053458"/>
         <w:rPr>
@@ -5314,7 +5465,6 @@
     </w:p>
     <w:p>
       <w:pPr>
-        <w:pageBreakBefore/>
         <w:shd w:val="clear" w:color="auto" w:fill="1A3A5C"/>
         <w:divId w:val="1768037407"/>
         <w:rPr>
@@ -5343,7 +5493,7 @@
     <w:p>
       <w:pPr>
         <w:pStyle w:val="Heading1"/>
-        <w:pageBreakBefore/>
+        <w:keepNext w:val="0"/>
         <w:spacing w:before="100"/>
         <w:divId w:val="1522088563"/>
         <w:rPr>
@@ -5362,7 +5512,6 @@
     <w:p>
       <w:pPr>
         <w:pStyle w:val="NormalWeb"/>
-        <w:pageBreakBefore/>
         <w:divId w:val="1522088563"/>
         <w:rPr>
           <w:rFonts w:ascii="Calibri" w:hAnsi="Calibri" w:cs="Calibri"/>
@@ -5637,16 +5786,7 @@
                 <w:sz w:val="18"/>
                 <w:szCs w:val="18"/>
               </w:rPr>
-              <w:t xml:space="preserve">Full photorealistic 3D interior model · </w:t>
-            </w:r>
-            <w:r>
-              <w:rPr>
-                <w:rFonts w:ascii="Calibri" w:eastAsia="Times New Roman" w:hAnsi="Calibri" w:cs="Calibri"/>
-                <w:color w:val="4A5568"/>
-                <w:sz w:val="18"/>
-                <w:szCs w:val="18"/>
-              </w:rPr>
-              <w:t>Accurate room layout, proportions, ceiling heights · Realistic flooring, wall finishes, cabinetry, fixtures, and furniture</w:t>
+              <w:t>Full photorealistic 3D interior model · Accurate room layout, proportions, ceiling heights · Realistic flooring, wall finishes, cabinetry, fixtures, and furniture</w:t>
             </w:r>
           </w:p>
         </w:tc>
@@ -5982,6 +6122,7 @@
                 <w:sz w:val="19"/>
                 <w:szCs w:val="19"/>
               </w:rPr>
+              <w:lastRenderedPageBreak/>
               <w:t>360° Amenity Panorama (Gym, Pool, Lobby, etc.)</w:t>
             </w:r>
             <w:r>
@@ -6362,7 +6503,8 @@
     <w:p>
       <w:pPr>
         <w:pStyle w:val="Heading2"/>
-        <w:pageBreakBefore/>
+        <w:keepNext w:val="0"/>
+        <w:spacing w:before="80"/>
         <w:divId w:val="1895585453"/>
         <w:rPr>
           <w:rFonts w:ascii="Calibri" w:eastAsia="Times New Roman" w:hAnsi="Calibri" w:cs="Calibri"/>
@@ -7417,7 +7559,6 @@
     </w:tbl>
     <w:p>
       <w:pPr>
-        <w:pageBreakBefore/>
         <w:shd w:val="clear" w:color="auto" w:fill="1A3A5C"/>
         <w:divId w:val="1909069349"/>
         <w:rPr>
@@ -7446,7 +7587,7 @@
     <w:p>
       <w:pPr>
         <w:pStyle w:val="Heading1"/>
-        <w:pageBreakBefore/>
+        <w:keepNext w:val="0"/>
         <w:spacing w:before="100"/>
         <w:divId w:val="1638728544"/>
         <w:rPr>
@@ -7465,7 +7606,6 @@
     <w:p>
       <w:pPr>
         <w:pStyle w:val="NormalWeb"/>
-        <w:pageBreakBefore/>
         <w:divId w:val="1638728544"/>
         <w:rPr>
           <w:rFonts w:ascii="Calibri" w:hAnsi="Calibri" w:cs="Calibri"/>
@@ -7722,6 +7862,7 @@
                 <w:sz w:val="19"/>
                 <w:szCs w:val="19"/>
               </w:rPr>
+              <w:lastRenderedPageBreak/>
               <w:t>3D Villa Unit Layout — Per Floor Level</w:t>
             </w:r>
             <w:r>
@@ -8094,16 +8235,7 @@
                 <w:sz w:val="18"/>
                 <w:szCs w:val="18"/>
               </w:rPr>
-              <w:t xml:space="preserve">Garden, driveway, outdoor seating, terrace · </w:t>
-            </w:r>
-            <w:r>
-              <w:rPr>
-                <w:rFonts w:ascii="Calibri" w:eastAsia="Times New Roman" w:hAnsi="Calibri" w:cs="Calibri"/>
-                <w:color w:val="4A5568"/>
-                <w:sz w:val="18"/>
-                <w:szCs w:val="18"/>
-              </w:rPr>
-              <w:t>Aerial perspective option for compound orientation shots</w:t>
+              <w:t>Garden, driveway, outdoor seating, terrace · Aerial perspective option for compound orientation shots</w:t>
             </w:r>
           </w:p>
         </w:tc>
@@ -8642,7 +8774,8 @@
     <w:p>
       <w:pPr>
         <w:pStyle w:val="Heading2"/>
-        <w:pageBreakBefore/>
+        <w:keepNext w:val="0"/>
+        <w:spacing w:before="80"/>
         <w:divId w:val="438792322"/>
         <w:rPr>
           <w:rFonts w:ascii="Calibri" w:eastAsia="Times New Roman" w:hAnsi="Calibri" w:cs="Calibri"/>
@@ -9214,16 +9347,7 @@
                 <w:sz w:val="19"/>
                 <w:szCs w:val="19"/>
               </w:rPr>
-              <w:t xml:space="preserve">360° Exterior &amp; </w:t>
-            </w:r>
-            <w:r>
-              <w:rPr>
-                <w:rFonts w:ascii="Calibri" w:eastAsia="Times New Roman" w:hAnsi="Calibri" w:cs="Calibri"/>
-                <w:color w:val="1A1A1A"/>
-                <w:sz w:val="19"/>
-                <w:szCs w:val="19"/>
-              </w:rPr>
-              <w:t>Garden Panorama (2 typologies)</w:t>
+              <w:t>360° Exterior &amp; Garden Panorama (2 typologies)</w:t>
             </w:r>
           </w:p>
         </w:tc>
@@ -9858,6 +9982,7 @@
                 <w:sz w:val="17"/>
                 <w:szCs w:val="17"/>
               </w:rPr>
+              <w:lastRenderedPageBreak/>
               <w:t>Indicative only. Final pricing confirmed after scope review. Add 15% VAT.</w:t>
             </w:r>
           </w:p>
@@ -9866,7 +9991,6 @@
     </w:tbl>
     <w:p>
       <w:pPr>
-        <w:pageBreakBefore/>
         <w:shd w:val="clear" w:color="auto" w:fill="1A3A5C"/>
         <w:divId w:val="1965115031"/>
         <w:rPr>
@@ -9895,7 +10019,7 @@
     <w:p>
       <w:pPr>
         <w:pStyle w:val="Heading1"/>
-        <w:pageBreakBefore/>
+        <w:keepNext w:val="0"/>
         <w:spacing w:before="100"/>
         <w:divId w:val="1896964553"/>
         <w:rPr>
@@ -9914,7 +10038,6 @@
     <w:p>
       <w:pPr>
         <w:pStyle w:val="NormalWeb"/>
-        <w:pageBreakBefore/>
         <w:divId w:val="1896964553"/>
         <w:rPr>
           <w:rFonts w:ascii="Calibri" w:hAnsi="Calibri" w:cs="Calibri"/>
@@ -9930,16 +10053,7 @@
           <w:sz w:val="20"/>
           <w:szCs w:val="20"/>
         </w:rPr>
-        <w:t xml:space="preserve">All video content produced by Design Zone is rendered from the same 3D environment used to build the interactive TwinMaq platform — guaranteeing full visual consistency across every marketing channel. Videos are not produced from a separate pipeline; every frame is rendered from the same photorealistic assets buyers interact with in the platform. Deliverables are optimised for social media (Instagram Reels, YouTube, LinkedIn, TikTok), digital advertising, real estate portal listings, WhatsApp distribution, </w:t>
-      </w:r>
-      <w:r>
-        <w:rPr>
-          <w:rFonts w:ascii="Calibri" w:hAnsi="Calibri" w:cs="Calibri"/>
-          <w:color w:val="1A1A1A"/>
-          <w:sz w:val="20"/>
-          <w:szCs w:val="20"/>
-        </w:rPr>
-        <w:t>and large-format sales centre screens.</w:t>
+        <w:t>All video content produced by Design Zone is rendered from the same 3D environment used to build the interactive TwinMaq platform — guaranteeing full visual consistency across every marketing channel. Videos are not produced from a separate pipeline; every frame is rendered from the same photorealistic assets buyers interact with in the platform. Deliverables are optimised for social media (Instagram Reels, YouTube, LinkedIn, TikTok), digital advertising, real estate portal listings, WhatsApp distribution, and large-format sales centre screens.</w:t>
       </w:r>
     </w:p>
     <w:tbl>
@@ -11079,7 +11193,6 @@
     </w:tbl>
     <w:p>
       <w:pPr>
-        <w:pageBreakBefore/>
         <w:shd w:val="clear" w:color="auto" w:fill="EEF3F9"/>
         <w:divId w:val="517043668"/>
         <w:rPr>
@@ -11105,21 +11218,11 @@
           <w:sz w:val="19"/>
           <w:szCs w:val="19"/>
         </w:rPr>
-        <w:t xml:space="preserve"> </w:t>
-      </w:r>
-      <w:r>
-        <w:rPr>
-          <w:rFonts w:ascii="Calibri" w:eastAsia="Times New Roman" w:hAnsi="Calibri" w:cs="Calibri"/>
-          <w:color w:val="1A1A1A"/>
-          <w:sz w:val="19"/>
-          <w:szCs w:val="19"/>
-        </w:rPr>
-        <w:t xml:space="preserve">Because all TwinMaq videos are rendered from the same 3D environment as the interactive platform, your social media videos, investor presentation videos, and in-platform walkthrough experience will always show exactly the same finishes, materials, lighting, and layout — with zero visual inconsistency between channels. </w:t>
+        <w:t xml:space="preserve"> Because all TwinMaq videos are rendered from the same 3D environment as the interactive platform, your social media videos, investor presentation videos, and in-platform walkthrough experience will always show exactly the same finishes, materials, lighting, and layout — with zero visual inconsistency between channels. </w:t>
       </w:r>
     </w:p>
     <w:p>
       <w:pPr>
-        <w:pageBreakBefore/>
         <w:shd w:val="clear" w:color="auto" w:fill="1A3A5C"/>
         <w:divId w:val="259873771"/>
         <w:rPr>
@@ -11148,7 +11251,7 @@
     <w:p>
       <w:pPr>
         <w:pStyle w:val="Heading1"/>
-        <w:pageBreakBefore/>
+        <w:keepNext w:val="0"/>
         <w:spacing w:before="100"/>
         <w:divId w:val="272907886"/>
         <w:rPr>
@@ -11167,7 +11270,6 @@
     <w:p>
       <w:pPr>
         <w:pStyle w:val="NormalWeb"/>
-        <w:pageBreakBefore/>
         <w:divId w:val="272907886"/>
         <w:rPr>
           <w:rFonts w:ascii="Calibri" w:hAnsi="Calibri" w:cs="Calibri"/>
@@ -11183,13 +11285,15 @@
           <w:sz w:val="20"/>
           <w:szCs w:val="20"/>
         </w:rPr>
+        <w:lastRenderedPageBreak/>
         <w:t>All figures below are indicative, based on mid-range pricing across all service categories, and are provided for initial budget planning. A confirmed, fixed-price quotation is issued after detailed scope review. All prices in SAR, exclusive of 15% VAT.</w:t>
       </w:r>
     </w:p>
     <w:p>
       <w:pPr>
         <w:pStyle w:val="Heading2"/>
-        <w:pageBreakBefore/>
+        <w:keepNext w:val="0"/>
+        <w:spacing w:before="80"/>
         <w:divId w:val="1227036554"/>
         <w:rPr>
           <w:rFonts w:ascii="Calibri" w:eastAsia="Times New Roman" w:hAnsi="Calibri" w:cs="Calibri"/>
@@ -11477,16 +11581,7 @@
                 <w:sz w:val="19"/>
                 <w:szCs w:val="19"/>
               </w:rPr>
-              <w:t xml:space="preserve">Up to 30 units · 1–2 typologies · </w:t>
-            </w:r>
-            <w:r>
-              <w:rPr>
-                <w:rFonts w:ascii="Calibri" w:eastAsia="Times New Roman" w:hAnsi="Calibri" w:cs="Calibri"/>
-                <w:color w:val="1A1A1A"/>
-                <w:sz w:val="19"/>
-                <w:szCs w:val="19"/>
-              </w:rPr>
-              <w:t>Basic amenities (3 panoramas)</w:t>
+              <w:t>Up to 30 units · 1–2 typologies · Basic amenities (3 panoramas)</w:t>
             </w:r>
           </w:p>
         </w:tc>
@@ -12046,7 +12141,8 @@
     <w:p>
       <w:pPr>
         <w:pStyle w:val="Heading2"/>
-        <w:pageBreakBefore/>
+        <w:keepNext w:val="0"/>
+        <w:spacing w:before="80"/>
         <w:divId w:val="257063343"/>
         <w:rPr>
           <w:rFonts w:ascii="Calibri" w:eastAsia="Times New Roman" w:hAnsi="Calibri" w:cs="Calibri"/>
@@ -12736,7 +12832,8 @@
     <w:p>
       <w:pPr>
         <w:pStyle w:val="Heading2"/>
-        <w:pageBreakBefore/>
+        <w:keepNext w:val="0"/>
+        <w:spacing w:before="80"/>
         <w:divId w:val="1520316673"/>
         <w:rPr>
           <w:rFonts w:ascii="Calibri" w:eastAsia="Times New Roman" w:hAnsi="Calibri" w:cs="Calibri"/>
@@ -13308,6 +13405,7 @@
                 <w:sz w:val="17"/>
                 <w:szCs w:val="17"/>
               </w:rPr>
+              <w:lastRenderedPageBreak/>
               <w:t>All estimates include the Core Platform Package (Section 03). These are budget-planning figures only. A scope-confirmed fixed quotation is issued after the project brief is reviewed and signed. Add 15% VAT.</w:t>
             </w:r>
           </w:p>
@@ -13316,7 +13414,6 @@
     </w:tbl>
     <w:p>
       <w:pPr>
-        <w:pageBreakBefore/>
         <w:shd w:val="clear" w:color="auto" w:fill="1A3A5C"/>
         <w:divId w:val="281426089"/>
         <w:rPr>
@@ -13345,7 +13442,7 @@
     <w:p>
       <w:pPr>
         <w:pStyle w:val="Heading1"/>
-        <w:pageBreakBefore/>
+        <w:keepNext w:val="0"/>
         <w:spacing w:before="100"/>
         <w:divId w:val="1740665472"/>
         <w:rPr>
@@ -13364,7 +13461,6 @@
     <w:p>
       <w:pPr>
         <w:pStyle w:val="NormalWeb"/>
-        <w:pageBreakBefore/>
         <w:divId w:val="1740665472"/>
         <w:rPr>
           <w:rFonts w:ascii="Calibri" w:hAnsi="Calibri" w:cs="Calibri"/>
@@ -13630,16 +13726,7 @@
                 <w:sz w:val="19"/>
                 <w:szCs w:val="19"/>
               </w:rPr>
-              <w:t xml:space="preserve"> </w:t>
-            </w:r>
-            <w:r>
-              <w:rPr>
-                <w:rFonts w:ascii="Calibri" w:eastAsia="Times New Roman" w:hAnsi="Calibri" w:cs="Calibri"/>
-                <w:color w:val="1A1A1A"/>
-                <w:sz w:val="19"/>
-                <w:szCs w:val="19"/>
-              </w:rPr>
-              <w:t>— Real-time finish customisation inside unit (TwinMaq Exclusive)</w:t>
+              <w:t xml:space="preserve"> — Real-time finish customisation inside unit (TwinMaq Exclusive)</w:t>
             </w:r>
           </w:p>
         </w:tc>
@@ -14311,16 +14398,7 @@
                 <w:sz w:val="19"/>
                 <w:szCs w:val="19"/>
               </w:rPr>
-              <w:t xml:space="preserve"> </w:t>
-            </w:r>
-            <w:r>
-              <w:rPr>
-                <w:rFonts w:ascii="Calibri" w:eastAsia="Times New Roman" w:hAnsi="Calibri" w:cs="Calibri"/>
-                <w:color w:val="1A1A1A"/>
-                <w:sz w:val="19"/>
-                <w:szCs w:val="19"/>
-              </w:rPr>
-              <w:t>— Pre-programmed sequential auto-tour; ideal for kiosks and events</w:t>
+              <w:t xml:space="preserve"> — Pre-programmed sequential auto-tour; ideal for kiosks and events</w:t>
             </w:r>
           </w:p>
         </w:tc>
@@ -14992,16 +15070,7 @@
                 <w:sz w:val="19"/>
                 <w:szCs w:val="19"/>
               </w:rPr>
-              <w:t xml:space="preserve"> </w:t>
-            </w:r>
-            <w:r>
-              <w:rPr>
-                <w:rFonts w:ascii="Calibri" w:eastAsia="Times New Roman" w:hAnsi="Calibri" w:cs="Calibri"/>
-                <w:color w:val="1A1A1A"/>
-                <w:sz w:val="19"/>
-                <w:szCs w:val="19"/>
-              </w:rPr>
-              <w:t>— Design Zone team at sales launch, exhibition, or investor event</w:t>
+              <w:t xml:space="preserve"> — Design Zone team at sales launch, exhibition, or investor event</w:t>
             </w:r>
           </w:p>
         </w:tc>
@@ -15334,6 +15403,7 @@
                 <w:sz w:val="17"/>
                 <w:szCs w:val="17"/>
               </w:rPr>
+              <w:lastRenderedPageBreak/>
               <w:t>All add-on prices exclusive of 15% VAT. No verbal or informal instructions accepted as authorisation for additional work. Design Zone issues a written cost estimate before any add-on work commences.</w:t>
             </w:r>
           </w:p>
@@ -15342,7 +15412,6 @@
     </w:tbl>
     <w:p>
       <w:pPr>
-        <w:pageBreakBefore/>
         <w:shd w:val="clear" w:color="auto" w:fill="1A3A5C"/>
         <w:divId w:val="982196899"/>
         <w:rPr>
@@ -15371,7 +15440,7 @@
     <w:p>
       <w:pPr>
         <w:pStyle w:val="Heading1"/>
-        <w:pageBreakBefore/>
+        <w:keepNext w:val="0"/>
         <w:spacing w:before="100"/>
         <w:divId w:val="787047110"/>
         <w:rPr>
@@ -15390,7 +15459,6 @@
     <w:p>
       <w:pPr>
         <w:pStyle w:val="NormalWeb"/>
-        <w:pageBreakBefore/>
         <w:divId w:val="787047110"/>
         <w:rPr>
           <w:rFonts w:ascii="Calibri" w:hAnsi="Calibri" w:cs="Calibri"/>
@@ -16453,7 +16521,6 @@
     </w:tbl>
     <w:p>
       <w:pPr>
-        <w:pageBreakBefore/>
         <w:shd w:val="clear" w:color="auto" w:fill="EEF3F9"/>
         <w:divId w:val="1239092511"/>
         <w:rPr>
@@ -16479,45 +16546,11 @@
           <w:sz w:val="19"/>
           <w:szCs w:val="19"/>
         </w:rPr>
-        <w:t xml:space="preserve"> </w:t>
-      </w:r>
-      <w:r>
-        <w:rPr>
-          <w:rFonts w:ascii="Calibri" w:eastAsia="Times New Roman" w:hAnsi="Calibri" w:cs="Calibri"/>
-          <w:color w:val="1A1A1A"/>
-          <w:sz w:val="19"/>
-          <w:szCs w:val="19"/>
-        </w:rPr>
-        <w:t xml:space="preserve">Account details provided upon agreement signing. Design Zone issues ZATCA-compliant tax invoices for each milestone. Final deliverables are withheld until M4 payment is confirmed. </w:t>
+        <w:t xml:space="preserve"> Account details provided upon agreement signing. Design Zone issues ZATCA-compliant tax invoices for each milestone. Final deliverables are withheld until M4 payment is confirmed. </w:t>
       </w:r>
     </w:p>
     <w:p>
       <w:pPr>
-        <w:pageBreakBefore/>
-        <w:spacing w:before="240" w:after="240"/>
-        <w:divId w:val="787047110"/>
-        <w:rPr>
-          <w:rFonts w:ascii="Calibri" w:eastAsia="Times New Roman" w:hAnsi="Calibri" w:cs="Calibri"/>
-          <w:color w:val="1A1A1A"/>
-          <w:sz w:val="20"/>
-          <w:szCs w:val="20"/>
-        </w:rPr>
-      </w:pPr>
-      <w:r>
-        <w:rPr>
-          <w:rFonts w:ascii="Calibri" w:eastAsia="Times New Roman" w:hAnsi="Calibri" w:cs="Calibri"/>
-          <w:color w:val="1A1A1A"/>
-          <w:sz w:val="20"/>
-          <w:szCs w:val="20"/>
-        </w:rPr>
-        <w:pict w14:anchorId="15E53956">
-          <v:rect id="_x0000_i1026" style="width:0;height:1.5pt" o:hralign="center" o:hrstd="t" o:hr="t" fillcolor="#a0a0a0" stroked="f"/>
-        </w:pict>
-      </w:r>
-    </w:p>
-    <w:p>
-      <w:pPr>
-        <w:pageBreakBefore/>
         <w:shd w:val="clear" w:color="auto" w:fill="1A3A5C"/>
         <w:divId w:val="1258951577"/>
         <w:rPr>
@@ -16546,7 +16579,7 @@
     <w:p>
       <w:pPr>
         <w:pStyle w:val="Heading1"/>
-        <w:pageBreakBefore/>
+        <w:keepNext w:val="0"/>
         <w:spacing w:before="100"/>
         <w:divId w:val="787047110"/>
         <w:rPr>
@@ -16565,7 +16598,6 @@
     <w:p>
       <w:pPr>
         <w:pStyle w:val="NormalWeb"/>
-        <w:pageBreakBefore/>
         <w:divId w:val="787047110"/>
         <w:rPr>
           <w:rFonts w:ascii="Calibri" w:hAnsi="Calibri" w:cs="Calibri"/>
@@ -16586,7 +16618,6 @@
     </w:p>
     <w:p>
       <w:pPr>
-        <w:pageBreakBefore/>
         <w:jc w:val="center"/>
         <w:textAlignment w:val="center"/>
         <w:divId w:val="1934170426"/>
@@ -16625,7 +16656,6 @@
     </w:p>
     <w:p>
       <w:pPr>
-        <w:pageBreakBefore/>
         <w:textAlignment w:val="top"/>
         <w:divId w:val="1148935751"/>
         <w:rPr>
@@ -16656,7 +16686,6 @@
     </w:p>
     <w:p>
       <w:pPr>
-        <w:pageBreakBefore/>
         <w:jc w:val="center"/>
         <w:textAlignment w:val="center"/>
         <w:divId w:val="1706715362"/>
@@ -16695,7 +16724,6 @@
     </w:p>
     <w:p>
       <w:pPr>
-        <w:pageBreakBefore/>
         <w:textAlignment w:val="top"/>
         <w:divId w:val="1001546931"/>
         <w:rPr>
@@ -16712,6 +16740,7 @@
           <w:sz w:val="20"/>
           <w:szCs w:val="20"/>
         </w:rPr>
+        <w:lastRenderedPageBreak/>
         <w:t>Second Revision — Included at No Charge.</w:t>
       </w:r>
       <w:r>
@@ -16726,7 +16755,6 @@
     </w:p>
     <w:p>
       <w:pPr>
-        <w:pageBreakBefore/>
         <w:jc w:val="center"/>
         <w:textAlignment w:val="center"/>
         <w:divId w:val="1838958986"/>
@@ -16765,7 +16793,6 @@
     </w:p>
     <w:p>
       <w:pPr>
-        <w:pageBreakBefore/>
         <w:textAlignment w:val="top"/>
         <w:divId w:val="1426614370"/>
         <w:rPr>
@@ -16796,7 +16823,6 @@
     </w:p>
     <w:p>
       <w:pPr>
-        <w:pageBreakBefore/>
         <w:shd w:val="clear" w:color="auto" w:fill="EEF3F9"/>
         <w:divId w:val="621351081"/>
         <w:rPr>
@@ -16827,7 +16853,6 @@
     </w:p>
     <w:p>
       <w:pPr>
-        <w:pageBreakBefore/>
         <w:shd w:val="clear" w:color="auto" w:fill="1A3A5C"/>
         <w:divId w:val="1555002217"/>
         <w:rPr>
@@ -16856,7 +16881,7 @@
     <w:p>
       <w:pPr>
         <w:pStyle w:val="Heading1"/>
-        <w:pageBreakBefore/>
+        <w:keepNext w:val="0"/>
         <w:spacing w:before="100"/>
         <w:divId w:val="2068912877"/>
         <w:rPr>
@@ -16875,7 +16900,6 @@
     <w:p>
       <w:pPr>
         <w:pStyle w:val="NormalWeb"/>
-        <w:pageBreakBefore/>
         <w:divId w:val="2068912877"/>
         <w:rPr>
           <w:rFonts w:ascii="Calibri" w:hAnsi="Calibri" w:cs="Calibri"/>
@@ -16915,7 +16939,8 @@
     <w:p>
       <w:pPr>
         <w:pStyle w:val="Heading2"/>
-        <w:pageBreakBefore/>
+        <w:keepNext w:val="0"/>
+        <w:spacing w:before="80"/>
         <w:divId w:val="778649784"/>
         <w:rPr>
           <w:rFonts w:ascii="Calibri" w:eastAsia="Times New Roman" w:hAnsi="Calibri" w:cs="Calibri"/>
@@ -16931,7 +16956,6 @@
     <w:p>
       <w:pPr>
         <w:pStyle w:val="NormalWeb"/>
-        <w:pageBreakBefore/>
         <w:divId w:val="778649784"/>
         <w:rPr>
           <w:rFonts w:ascii="Calibri" w:hAnsi="Calibri" w:cs="Calibri"/>
@@ -16953,7 +16977,8 @@
     <w:p>
       <w:pPr>
         <w:pStyle w:val="Heading2"/>
-        <w:pageBreakBefore/>
+        <w:keepNext w:val="0"/>
+        <w:spacing w:before="80"/>
         <w:divId w:val="1804081276"/>
         <w:rPr>
           <w:rFonts w:ascii="Calibri" w:eastAsia="Times New Roman" w:hAnsi="Calibri" w:cs="Calibri"/>
@@ -16969,7 +16994,6 @@
     <w:p>
       <w:pPr>
         <w:pStyle w:val="NormalWeb"/>
-        <w:pageBreakBefore/>
         <w:divId w:val="1804081276"/>
         <w:rPr>
           <w:rFonts w:ascii="Calibri" w:hAnsi="Calibri" w:cs="Calibri"/>
@@ -16985,22 +17009,14 @@
           <w:sz w:val="20"/>
           <w:szCs w:val="20"/>
         </w:rPr>
-        <w:t xml:space="preserve">All source materials, CAD files, 3D models, brand assets, and project documentation must be delivered by the Client within Week 1 of commencement. No new project files will be accepted more than two weeks after the project start date. Any area, building, or unit typology without compliant files at this deadline will be excluded from the delivery scope — even if originally listed — and no refund will be applied for items excluded due to late file delivery. Design Zone will notify the Client of any file gaps </w:t>
-      </w:r>
-      <w:r>
-        <w:rPr>
-          <w:rFonts w:ascii="Calibri" w:hAnsi="Calibri" w:cs="Calibri"/>
-          <w:color w:val="1A1A1A"/>
-          <w:sz w:val="20"/>
-          <w:szCs w:val="20"/>
-        </w:rPr>
-        <w:t>identified during onboarding.</w:t>
+        <w:t>All source materials, CAD files, 3D models, brand assets, and project documentation must be delivered by the Client within Week 1 of commencement. No new project files will be accepted more than two weeks after the project start date. Any area, building, or unit typology without compliant files at this deadline will be excluded from the delivery scope — even if originally listed — and no refund will be applied for items excluded due to late file delivery. Design Zone will notify the Client of any file gaps identified during onboarding.</w:t>
       </w:r>
     </w:p>
     <w:p>
       <w:pPr>
         <w:pStyle w:val="Heading2"/>
-        <w:pageBreakBefore/>
+        <w:keepNext w:val="0"/>
+        <w:spacing w:before="80"/>
         <w:divId w:val="1404983787"/>
         <w:rPr>
           <w:rFonts w:ascii="Calibri" w:eastAsia="Times New Roman" w:hAnsi="Calibri" w:cs="Calibri"/>
@@ -17016,7 +17032,6 @@
     <w:p>
       <w:pPr>
         <w:pStyle w:val="NormalWeb"/>
-        <w:pageBreakBefore/>
         <w:divId w:val="1404983787"/>
         <w:rPr>
           <w:rFonts w:ascii="Calibri" w:hAnsi="Calibri" w:cs="Calibri"/>
@@ -17038,7 +17053,8 @@
     <w:p>
       <w:pPr>
         <w:pStyle w:val="Heading2"/>
-        <w:pageBreakBefore/>
+        <w:keepNext w:val="0"/>
+        <w:spacing w:before="80"/>
         <w:divId w:val="910238029"/>
         <w:rPr>
           <w:rFonts w:ascii="Calibri" w:eastAsia="Times New Roman" w:hAnsi="Calibri" w:cs="Calibri"/>
@@ -17054,7 +17070,6 @@
     <w:p>
       <w:pPr>
         <w:pStyle w:val="NormalWeb"/>
-        <w:pageBreakBefore/>
         <w:divId w:val="910238029"/>
         <w:rPr>
           <w:rFonts w:ascii="Calibri" w:hAnsi="Calibri" w:cs="Calibri"/>
@@ -17076,7 +17091,8 @@
     <w:p>
       <w:pPr>
         <w:pStyle w:val="Heading2"/>
-        <w:pageBreakBefore/>
+        <w:keepNext w:val="0"/>
+        <w:spacing w:before="80"/>
         <w:divId w:val="468060392"/>
         <w:rPr>
           <w:rFonts w:ascii="Calibri" w:eastAsia="Times New Roman" w:hAnsi="Calibri" w:cs="Calibri"/>
@@ -17092,7 +17108,6 @@
     <w:p>
       <w:pPr>
         <w:pStyle w:val="NormalWeb"/>
-        <w:pageBreakBefore/>
         <w:divId w:val="468060392"/>
         <w:rPr>
           <w:rFonts w:ascii="Calibri" w:hAnsi="Calibri" w:cs="Calibri"/>
@@ -17108,22 +17123,14 @@
           <w:sz w:val="20"/>
           <w:szCs w:val="20"/>
         </w:rPr>
-        <w:t>The delivery timeline assumes timely client file delivery within Week 1 and prompt, consolidated feedback at each review milestone. Delays attributable to the client — including late file submission, delayed review feedback, or failure to confirm milestone payments — extend the schedule on a day-for-day basis and do not constitute a breach by Design Zone. If the project is paused more than 90 calendar days, scope, cost, and timeline will be mutually reviewed before work resumes, and Design Zone reserves the</w:t>
-      </w:r>
-      <w:r>
-        <w:rPr>
-          <w:rFonts w:ascii="Calibri" w:hAnsi="Calibri" w:cs="Calibri"/>
-          <w:color w:val="1A1A1A"/>
-          <w:sz w:val="20"/>
-          <w:szCs w:val="20"/>
-        </w:rPr>
-        <w:t xml:space="preserve"> right to revise pricing to reflect cost changes during the pause.</w:t>
+        <w:t>The delivery timeline assumes timely client file delivery within Week 1 and prompt, consolidated feedback at each review milestone. Delays attributable to the client — including late file submission, delayed review feedback, or failure to confirm milestone payments — extend the schedule on a day-for-day basis and do not constitute a breach by Design Zone. If the project is paused more than 90 calendar days, scope, cost, and timeline will be mutually reviewed before work resumes, and Design Zone reserves the right to revise pricing to reflect cost changes during the pause.</w:t>
       </w:r>
     </w:p>
     <w:p>
       <w:pPr>
         <w:pStyle w:val="Heading2"/>
-        <w:pageBreakBefore/>
+        <w:keepNext w:val="0"/>
+        <w:spacing w:before="80"/>
         <w:divId w:val="1007098430"/>
         <w:rPr>
           <w:rFonts w:ascii="Calibri" w:eastAsia="Times New Roman" w:hAnsi="Calibri" w:cs="Calibri"/>
@@ -17139,7 +17146,6 @@
     <w:p>
       <w:pPr>
         <w:pStyle w:val="NormalWeb"/>
-        <w:pageBreakBefore/>
         <w:divId w:val="1007098430"/>
         <w:rPr>
           <w:rFonts w:ascii="Calibri" w:hAnsi="Calibri" w:cs="Calibri"/>
@@ -17155,13 +17161,15 @@
           <w:sz w:val="20"/>
           <w:szCs w:val="20"/>
         </w:rPr>
+        <w:lastRenderedPageBreak/>
         <w:t>All invoices are due within five (5) business days of the invoice date. Late payments may result in suspension of active project work. Final deliverables — live platform URL, admin credentials, video files, and AutoCAD DWG files — are withheld until all outstanding balances are cleared in full. In the event of cancellation after commencement, all payments received are non-refundable, and work completed to date is delivered in its current state within 5 business days.</w:t>
       </w:r>
     </w:p>
     <w:p>
       <w:pPr>
         <w:pStyle w:val="Heading2"/>
-        <w:pageBreakBefore/>
+        <w:keepNext w:val="0"/>
+        <w:spacing w:before="80"/>
         <w:divId w:val="1568611105"/>
         <w:rPr>
           <w:rFonts w:ascii="Calibri" w:eastAsia="Times New Roman" w:hAnsi="Calibri" w:cs="Calibri"/>
@@ -17177,7 +17185,6 @@
     <w:p>
       <w:pPr>
         <w:pStyle w:val="NormalWeb"/>
-        <w:pageBreakBefore/>
         <w:divId w:val="1568611105"/>
         <w:rPr>
           <w:rFonts w:ascii="Calibri" w:hAnsi="Calibri" w:cs="Calibri"/>
@@ -17193,22 +17200,14 @@
           <w:sz w:val="20"/>
           <w:szCs w:val="20"/>
         </w:rPr>
-        <w:t>Upon receipt of full and final payment, the Client receives full ownership of all project-specific delivered assets: the configured TwinMaq platform, 3D renders, panoramic images, walkthrough videos, and AutoCAD DWG files. Design Zone retains full ownership of its proprietary platform engine, TwinMaq software framework, and development codebase. The Client receives a fully licensed right to use, host, and distribute the delivered platform — but not to access, copy, or redistribute the underlying source code</w:t>
-      </w:r>
-      <w:r>
-        <w:rPr>
-          <w:rFonts w:ascii="Calibri" w:hAnsi="Calibri" w:cs="Calibri"/>
-          <w:color w:val="1A1A1A"/>
-          <w:sz w:val="20"/>
-          <w:szCs w:val="20"/>
-        </w:rPr>
-        <w:t xml:space="preserve"> or engine.</w:t>
+        <w:t>Upon receipt of full and final payment, the Client receives full ownership of all project-specific delivered assets: the configured TwinMaq platform, 3D renders, panoramic images, walkthrough videos, and AutoCAD DWG files. Design Zone retains full ownership of its proprietary platform engine, TwinMaq software framework, and development codebase. The Client receives a fully licensed right to use, host, and distribute the delivered platform — but not to access, copy, or redistribute the underlying source code or engine.</w:t>
       </w:r>
     </w:p>
     <w:p>
       <w:pPr>
         <w:pStyle w:val="Heading2"/>
-        <w:pageBreakBefore/>
+        <w:keepNext w:val="0"/>
+        <w:spacing w:before="80"/>
         <w:divId w:val="1474638571"/>
         <w:rPr>
           <w:rFonts w:ascii="Calibri" w:eastAsia="Times New Roman" w:hAnsi="Calibri" w:cs="Calibri"/>
@@ -17224,7 +17223,6 @@
     <w:p>
       <w:pPr>
         <w:pStyle w:val="NormalWeb"/>
-        <w:pageBreakBefore/>
         <w:divId w:val="1474638571"/>
         <w:rPr>
           <w:rFonts w:ascii="Calibri" w:hAnsi="Calibri" w:cs="Calibri"/>
@@ -17246,7 +17244,8 @@
     <w:p>
       <w:pPr>
         <w:pStyle w:val="Heading2"/>
-        <w:pageBreakBefore/>
+        <w:keepNext w:val="0"/>
+        <w:spacing w:before="80"/>
         <w:divId w:val="1880776214"/>
         <w:rPr>
           <w:rFonts w:ascii="Calibri" w:eastAsia="Times New Roman" w:hAnsi="Calibri" w:cs="Calibri"/>
@@ -17262,7 +17261,6 @@
     <w:p>
       <w:pPr>
         <w:pStyle w:val="NormalWeb"/>
-        <w:pageBreakBefore/>
         <w:divId w:val="1880776214"/>
         <w:rPr>
           <w:rFonts w:ascii="Calibri" w:hAnsi="Calibri" w:cs="Calibri"/>
@@ -17284,7 +17282,8 @@
     <w:p>
       <w:pPr>
         <w:pStyle w:val="Heading2"/>
-        <w:pageBreakBefore/>
+        <w:keepNext w:val="0"/>
+        <w:spacing w:before="80"/>
         <w:divId w:val="122894565"/>
         <w:rPr>
           <w:rFonts w:ascii="Calibri" w:eastAsia="Times New Roman" w:hAnsi="Calibri" w:cs="Calibri"/>
@@ -17300,7 +17299,6 @@
     <w:p>
       <w:pPr>
         <w:pStyle w:val="NormalWeb"/>
-        <w:pageBreakBefore/>
         <w:divId w:val="122894565"/>
         <w:rPr>
           <w:rFonts w:ascii="Calibri" w:hAnsi="Calibri" w:cs="Calibri"/>
@@ -17322,7 +17320,8 @@
     <w:p>
       <w:pPr>
         <w:pStyle w:val="Heading2"/>
-        <w:pageBreakBefore/>
+        <w:keepNext w:val="0"/>
+        <w:spacing w:before="80"/>
         <w:divId w:val="1086459232"/>
         <w:rPr>
           <w:rFonts w:ascii="Calibri" w:eastAsia="Times New Roman" w:hAnsi="Calibri" w:cs="Calibri"/>
@@ -17338,7 +17337,6 @@
     <w:p>
       <w:pPr>
         <w:pStyle w:val="NormalWeb"/>
-        <w:pageBreakBefore/>
         <w:divId w:val="1086459232"/>
         <w:rPr>
           <w:rFonts w:ascii="Calibri" w:hAnsi="Calibri" w:cs="Calibri"/>
@@ -17360,7 +17358,8 @@
     <w:p>
       <w:pPr>
         <w:pStyle w:val="Heading2"/>
-        <w:pageBreakBefore/>
+        <w:keepNext w:val="0"/>
+        <w:spacing w:before="80"/>
         <w:divId w:val="611207408"/>
         <w:rPr>
           <w:rFonts w:ascii="Calibri" w:eastAsia="Times New Roman" w:hAnsi="Calibri" w:cs="Calibri"/>
@@ -17376,7 +17375,6 @@
     <w:p>
       <w:pPr>
         <w:pStyle w:val="NormalWeb"/>
-        <w:pageBreakBefore/>
         <w:divId w:val="611207408"/>
         <w:rPr>
           <w:rFonts w:ascii="Calibri" w:hAnsi="Calibri" w:cs="Calibri"/>
@@ -17398,7 +17396,8 @@
     <w:p>
       <w:pPr>
         <w:pStyle w:val="Heading2"/>
-        <w:pageBreakBefore/>
+        <w:keepNext w:val="0"/>
+        <w:spacing w:before="80"/>
         <w:divId w:val="1205024171"/>
         <w:rPr>
           <w:rFonts w:ascii="Calibri" w:eastAsia="Times New Roman" w:hAnsi="Calibri" w:cs="Calibri"/>
@@ -17414,7 +17413,6 @@
     <w:p>
       <w:pPr>
         <w:pStyle w:val="NormalWeb"/>
-        <w:pageBreakBefore/>
         <w:divId w:val="1205024171"/>
         <w:rPr>
           <w:rFonts w:ascii="Calibri" w:hAnsi="Calibri" w:cs="Calibri"/>
@@ -17435,7 +17433,6 @@
     </w:p>
     <w:p>
       <w:pPr>
-        <w:pageBreakBefore/>
         <w:jc w:val="center"/>
         <w:divId w:val="1856772718"/>
         <w:rPr>

</xml_diff>